<commit_message>
docs: add MongoDB project documentation, presentation slides, and report files
</commit_message>
<xml_diff>
--- a/output/docx/VaultX_MongoDB_Project_Report.docx
+++ b/output/docx/VaultX_MongoDB_Project_Report.docx
@@ -16,6 +16,73 @@
           <w:sz w:val="48"/>
         </w:rPr>
       </w:pPr>
+      <w:r>
+        <w:rPr>
+          <w:noProof/>
+          <w:sz w:val="20"/>
+        </w:rPr>
+        <w:drawing>
+          <wp:inline distT="0" distB="0" distL="0" distR="0" wp14:anchorId="6CAAA62A" wp14:editId="3F08CC15">
+            <wp:extent cx="2865806" cy="1291227"/>
+            <wp:effectExtent l="0" t="0" r="0" b="4445"/>
+            <wp:docPr id="2073465676" name="Image 2"/>
+            <wp:cNvGraphicFramePr>
+              <a:graphicFrameLocks xmlns:a="http://schemas.openxmlformats.org/drawingml/2006/main"/>
+            </wp:cNvGraphicFramePr>
+            <a:graphic xmlns:a="http://schemas.openxmlformats.org/drawingml/2006/main">
+              <a:graphicData uri="http://schemas.openxmlformats.org/drawingml/2006/picture">
+                <pic:pic xmlns:pic="http://schemas.openxmlformats.org/drawingml/2006/picture">
+                  <pic:nvPicPr>
+                    <pic:cNvPr id="2" name="Image 2"/>
+                    <pic:cNvPicPr/>
+                  </pic:nvPicPr>
+                  <pic:blipFill>
+                    <a:blip r:embed="rId7" cstate="print"/>
+                    <a:stretch>
+                      <a:fillRect/>
+                    </a:stretch>
+                  </pic:blipFill>
+                  <pic:spPr>
+                    <a:xfrm>
+                      <a:off x="0" y="0"/>
+                      <a:ext cx="2875620" cy="1295649"/>
+                    </a:xfrm>
+                    <a:prstGeom prst="rect">
+                      <a:avLst/>
+                    </a:prstGeom>
+                  </pic:spPr>
+                </pic:pic>
+              </a:graphicData>
+            </a:graphic>
+          </wp:inline>
+        </w:drawing>
+      </w:r>
+    </w:p>
+    <w:p>
+      <w:pPr>
+        <w:rPr>
+          <w:b/>
+          <w:sz w:val="32"/>
+        </w:rPr>
+      </w:pPr>
+    </w:p>
+    <w:p>
+      <w:pPr>
+        <w:jc w:val="center"/>
+        <w:rPr>
+          <w:b/>
+          <w:sz w:val="32"/>
+        </w:rPr>
+      </w:pPr>
+    </w:p>
+    <w:p>
+      <w:pPr>
+        <w:jc w:val="center"/>
+        <w:rPr>
+          <w:b/>
+          <w:sz w:val="32"/>
+        </w:rPr>
+      </w:pPr>
     </w:p>
     <w:p>
       <w:pPr>
@@ -25,12 +92,42 @@
           <w:sz w:val="48"/>
         </w:rPr>
       </w:pPr>
-      <w:r>
+    </w:p>
+    <w:p>
+      <w:pPr>
+        <w:jc w:val="center"/>
         <w:rPr>
           <w:b/>
           <w:sz w:val="48"/>
         </w:rPr>
-        <w:t>VaultX</w:t>
+      </w:pPr>
+      <w:r>
+        <w:rPr>
+          <w:b/>
+          <w:sz w:val="48"/>
+        </w:rPr>
+        <w:t>I</w:t>
+      </w:r>
+      <w:r>
+        <w:rPr>
+          <w:b/>
+          <w:sz w:val="48"/>
+        </w:rPr>
+        <w:t>NTELLIGENT NOSQL DATABASES</w:t>
+      </w:r>
+      <w:r>
+        <w:rPr>
+          <w:b/>
+          <w:sz w:val="48"/>
+        </w:rPr>
+        <w:t xml:space="preserve"> </w:t>
+      </w:r>
+      <w:r>
+        <w:rPr>
+          <w:b/>
+          <w:sz w:val="48"/>
+        </w:rPr>
+        <w:t>Project Report</w:t>
       </w:r>
     </w:p>
     <w:p>
@@ -56,7 +153,7 @@
         <w:jc w:val="center"/>
         <w:rPr>
           <w:b/>
-          <w:sz w:val="32"/>
+          <w:sz w:val="48"/>
         </w:rPr>
       </w:pPr>
     </w:p>
@@ -68,19 +165,325 @@
           <w:sz w:val="48"/>
         </w:rPr>
       </w:pPr>
-      <w:r>
-        <w:rPr>
-          <w:b/>
-          <w:sz w:val="48"/>
-        </w:rPr>
-        <w:t>MongoDB Project Report</w:t>
-      </w:r>
+    </w:p>
+    <w:tbl>
+      <w:tblPr>
+        <w:tblStyle w:val="TableGrid"/>
+        <w:tblW w:w="10349" w:type="dxa"/>
+        <w:tblInd w:w="-318" w:type="dxa"/>
+        <w:tblLook w:val="04A0" w:firstRow="1" w:lastRow="0" w:firstColumn="1" w:lastColumn="0" w:noHBand="0" w:noVBand="1"/>
+      </w:tblPr>
+      <w:tblGrid>
+        <w:gridCol w:w="4962"/>
+        <w:gridCol w:w="5387"/>
+      </w:tblGrid>
+      <w:tr>
+        <w:tc>
+          <w:tcPr>
+            <w:tcW w:w="4962" w:type="dxa"/>
+          </w:tcPr>
+          <w:p>
+            <w:pPr>
+              <w:rPr>
+                <w:b/>
+                <w:sz w:val="48"/>
+              </w:rPr>
+            </w:pPr>
+            <w:r>
+              <w:rPr>
+                <w:b/>
+                <w:sz w:val="48"/>
+              </w:rPr>
+              <w:t xml:space="preserve">Course Code: </w:t>
+            </w:r>
+          </w:p>
+        </w:tc>
+        <w:tc>
+          <w:tcPr>
+            <w:tcW w:w="5387" w:type="dxa"/>
+          </w:tcPr>
+          <w:p>
+            <w:pPr>
+              <w:rPr>
+                <w:b/>
+                <w:sz w:val="48"/>
+              </w:rPr>
+            </w:pPr>
+            <w:r>
+              <w:rPr>
+                <w:b/>
+                <w:sz w:val="48"/>
+              </w:rPr>
+              <w:t>CSE494</w:t>
+            </w:r>
+          </w:p>
+        </w:tc>
+      </w:tr>
+      <w:tr>
+        <w:tc>
+          <w:tcPr>
+            <w:tcW w:w="4962" w:type="dxa"/>
+          </w:tcPr>
+          <w:p>
+            <w:pPr>
+              <w:rPr>
+                <w:b/>
+                <w:sz w:val="48"/>
+              </w:rPr>
+            </w:pPr>
+            <w:r>
+              <w:rPr>
+                <w:b/>
+                <w:sz w:val="48"/>
+              </w:rPr>
+              <w:t xml:space="preserve">Course Name: </w:t>
+            </w:r>
+          </w:p>
+        </w:tc>
+        <w:tc>
+          <w:tcPr>
+            <w:tcW w:w="5387" w:type="dxa"/>
+          </w:tcPr>
+          <w:p>
+            <w:pPr>
+              <w:rPr>
+                <w:b/>
+                <w:sz w:val="48"/>
+              </w:rPr>
+            </w:pPr>
+            <w:r>
+              <w:rPr>
+                <w:b/>
+                <w:sz w:val="48"/>
+              </w:rPr>
+              <w:t>I</w:t>
+            </w:r>
+            <w:r>
+              <w:rPr>
+                <w:b/>
+                <w:sz w:val="48"/>
+              </w:rPr>
+              <w:t>NTELLIGENT NOSQL DATABASES</w:t>
+            </w:r>
+          </w:p>
+        </w:tc>
+      </w:tr>
+      <w:tr>
+        <w:tc>
+          <w:tcPr>
+            <w:tcW w:w="4962" w:type="dxa"/>
+          </w:tcPr>
+          <w:p>
+            <w:pPr>
+              <w:rPr>
+                <w:b/>
+                <w:sz w:val="48"/>
+              </w:rPr>
+            </w:pPr>
+            <w:r>
+              <w:rPr>
+                <w:b/>
+                <w:sz w:val="48"/>
+              </w:rPr>
+              <w:t xml:space="preserve">Name: </w:t>
+            </w:r>
+          </w:p>
+        </w:tc>
+        <w:tc>
+          <w:tcPr>
+            <w:tcW w:w="5387" w:type="dxa"/>
+          </w:tcPr>
+          <w:p>
+            <w:pPr>
+              <w:rPr>
+                <w:b/>
+                <w:sz w:val="48"/>
+              </w:rPr>
+            </w:pPr>
+            <w:r>
+              <w:rPr>
+                <w:b/>
+                <w:sz w:val="48"/>
+              </w:rPr>
+              <w:t>Abijith C G</w:t>
+            </w:r>
+          </w:p>
+        </w:tc>
+      </w:tr>
+      <w:tr>
+        <w:tc>
+          <w:tcPr>
+            <w:tcW w:w="4962" w:type="dxa"/>
+          </w:tcPr>
+          <w:p>
+            <w:pPr>
+              <w:rPr>
+                <w:b/>
+                <w:sz w:val="48"/>
+              </w:rPr>
+            </w:pPr>
+            <w:r>
+              <w:rPr>
+                <w:b/>
+                <w:sz w:val="48"/>
+              </w:rPr>
+              <w:t>Registration N</w:t>
+            </w:r>
+            <w:r>
+              <w:rPr>
+                <w:b/>
+                <w:sz w:val="48"/>
+              </w:rPr>
+              <w:t>o</w:t>
+            </w:r>
+            <w:r>
+              <w:rPr>
+                <w:b/>
+                <w:sz w:val="48"/>
+              </w:rPr>
+              <w:t xml:space="preserve">: </w:t>
+            </w:r>
+          </w:p>
+        </w:tc>
+        <w:tc>
+          <w:tcPr>
+            <w:tcW w:w="5387" w:type="dxa"/>
+          </w:tcPr>
+          <w:p>
+            <w:pPr>
+              <w:rPr>
+                <w:b/>
+                <w:sz w:val="48"/>
+              </w:rPr>
+            </w:pPr>
+            <w:r>
+              <w:rPr>
+                <w:b/>
+                <w:sz w:val="48"/>
+              </w:rPr>
+              <w:t>124</w:t>
+            </w:r>
+            <w:r>
+              <w:rPr>
+                <w:b/>
+                <w:sz w:val="48"/>
+              </w:rPr>
+              <w:t>0</w:t>
+            </w:r>
+            <w:r>
+              <w:rPr>
+                <w:b/>
+                <w:sz w:val="48"/>
+              </w:rPr>
+              <w:t>3559</w:t>
+            </w:r>
+          </w:p>
+        </w:tc>
+      </w:tr>
+      <w:tr>
+        <w:tc>
+          <w:tcPr>
+            <w:tcW w:w="4962" w:type="dxa"/>
+          </w:tcPr>
+          <w:p>
+            <w:pPr>
+              <w:rPr>
+                <w:b/>
+                <w:sz w:val="48"/>
+              </w:rPr>
+            </w:pPr>
+            <w:r>
+              <w:rPr>
+                <w:b/>
+                <w:sz w:val="48"/>
+              </w:rPr>
+              <w:t>Project Name:</w:t>
+            </w:r>
+          </w:p>
+        </w:tc>
+        <w:tc>
+          <w:tcPr>
+            <w:tcW w:w="5387" w:type="dxa"/>
+          </w:tcPr>
+          <w:p>
+            <w:pPr>
+              <w:rPr>
+                <w:b/>
+                <w:sz w:val="48"/>
+                <w:lang w:val="en-IN"/>
+              </w:rPr>
+            </w:pPr>
+            <w:r>
+              <w:rPr>
+                <w:b/>
+                <w:bCs/>
+                <w:sz w:val="48"/>
+                <w:lang w:val="en-IN"/>
+              </w:rPr>
+              <w:t>Digital-Document-Vault</w:t>
+            </w:r>
+          </w:p>
+        </w:tc>
+      </w:tr>
+      <w:tr>
+        <w:tc>
+          <w:tcPr>
+            <w:tcW w:w="4962" w:type="dxa"/>
+          </w:tcPr>
+          <w:p>
+            <w:pPr>
+              <w:rPr>
+                <w:b/>
+                <w:sz w:val="48"/>
+              </w:rPr>
+            </w:pPr>
+            <w:r>
+              <w:rPr>
+                <w:b/>
+                <w:sz w:val="48"/>
+              </w:rPr>
+              <w:t xml:space="preserve">Project link: </w:t>
+            </w:r>
+          </w:p>
+        </w:tc>
+        <w:tc>
+          <w:tcPr>
+            <w:tcW w:w="5387" w:type="dxa"/>
+          </w:tcPr>
+          <w:p>
+            <w:pPr>
+              <w:rPr>
+                <w:b/>
+                <w:bCs/>
+                <w:sz w:val="48"/>
+                <w:lang w:val="en-IN"/>
+              </w:rPr>
+            </w:pPr>
+            <w:hyperlink r:id="rId8" w:history="1">
+              <w:r>
+                <w:rPr>
+                  <w:rStyle w:val="Hyperlink"/>
+                  <w:sz w:val="44"/>
+                  <w:szCs w:val="36"/>
+                </w:rPr>
+                <w:t>https://vaultx.abijith.me/</w:t>
+              </w:r>
+            </w:hyperlink>
+          </w:p>
+        </w:tc>
+      </w:tr>
+    </w:tbl>
+    <w:p>
+      <w:pPr>
+        <w:rPr>
+          <w:sz w:val="32"/>
+        </w:rPr>
+      </w:pPr>
     </w:p>
     <w:p>
       <w:pPr>
         <w:jc w:val="center"/>
         <w:rPr>
-          <w:b/>
           <w:sz w:val="32"/>
         </w:rPr>
       </w:pPr>
@@ -89,7 +492,6 @@
       <w:pPr>
         <w:jc w:val="center"/>
         <w:rPr>
-          <w:b/>
           <w:sz w:val="32"/>
         </w:rPr>
       </w:pPr>
@@ -97,214 +499,6 @@
     <w:p>
       <w:pPr>
         <w:jc w:val="center"/>
-        <w:rPr>
-          <w:b/>
-          <w:sz w:val="48"/>
-        </w:rPr>
-      </w:pPr>
-      <w:r>
-        <w:rPr>
-          <w:b/>
-          <w:sz w:val="48"/>
-        </w:rPr>
-        <w:t>Course Code CSE4940</w:t>
-      </w:r>
-    </w:p>
-    <w:p>
-      <w:pPr>
-        <w:jc w:val="center"/>
-        <w:rPr>
-          <w:b/>
-          <w:sz w:val="48"/>
-        </w:rPr>
-      </w:pPr>
-      <w:r>
-        <w:rPr>
-          <w:b/>
-          <w:sz w:val="48"/>
-        </w:rPr>
-        <w:t>Course Name MongoDB</w:t>
-      </w:r>
-    </w:p>
-    <w:p>
-      <w:pPr>
-        <w:jc w:val="center"/>
-        <w:rPr>
-          <w:b/>
-          <w:sz w:val="32"/>
-        </w:rPr>
-      </w:pPr>
-    </w:p>
-    <w:p>
-      <w:pPr>
-        <w:jc w:val="center"/>
-        <w:rPr>
-          <w:b/>
-          <w:sz w:val="32"/>
-        </w:rPr>
-      </w:pPr>
-    </w:p>
-    <w:p>
-      <w:pPr>
-        <w:jc w:val="center"/>
-        <w:rPr>
-          <w:b/>
-          <w:sz w:val="32"/>
-        </w:rPr>
-      </w:pPr>
-    </w:p>
-    <w:p>
-      <w:pPr>
-        <w:jc w:val="center"/>
-        <w:rPr>
-          <w:b/>
-          <w:sz w:val="48"/>
-        </w:rPr>
-      </w:pPr>
-      <w:r>
-        <w:rPr>
-          <w:b/>
-          <w:sz w:val="48"/>
-        </w:rPr>
-        <w:t>Abijith C G</w:t>
-      </w:r>
-    </w:p>
-    <w:p>
-      <w:pPr>
-        <w:jc w:val="center"/>
-        <w:rPr>
-          <w:b/>
-          <w:sz w:val="48"/>
-        </w:rPr>
-      </w:pPr>
-    </w:p>
-    <w:p>
-      <w:pPr>
-        <w:jc w:val="center"/>
-        <w:rPr>
-          <w:b/>
-          <w:sz w:val="48"/>
-        </w:rPr>
-      </w:pPr>
-      <w:r>
-        <w:rPr>
-          <w:b/>
-          <w:sz w:val="48"/>
-        </w:rPr>
-        <w:t>Registration Number 1243559</w:t>
-      </w:r>
-    </w:p>
-    <w:p>
-      <w:pPr>
-        <w:jc w:val="center"/>
-        <w:rPr>
-          <w:b/>
-          <w:sz w:val="48"/>
-        </w:rPr>
-      </w:pPr>
-    </w:p>
-    <w:p>
-      <w:pPr>
-        <w:jc w:val="center"/>
-        <w:rPr>
-          <w:sz w:val="48"/>
-        </w:rPr>
-      </w:pPr>
-    </w:p>
-    <w:p>
-      <w:pPr>
-        <w:jc w:val="center"/>
-        <w:rPr>
-          <w:sz w:val="32"/>
-        </w:rPr>
-      </w:pPr>
-    </w:p>
-    <w:p>
-      <w:pPr>
-        <w:jc w:val="center"/>
-        <w:rPr>
-          <w:sz w:val="32"/>
-        </w:rPr>
-      </w:pPr>
-    </w:p>
-    <w:p>
-      <w:pPr>
-        <w:jc w:val="center"/>
-        <w:rPr>
-          <w:sz w:val="32"/>
-        </w:rPr>
-      </w:pPr>
-    </w:p>
-    <w:p>
-      <w:pPr>
-        <w:jc w:val="center"/>
-        <w:rPr>
-          <w:sz w:val="32"/>
-        </w:rPr>
-      </w:pPr>
-    </w:p>
-    <w:p>
-      <w:pPr>
-        <w:jc w:val="center"/>
-        <w:rPr>
-          <w:sz w:val="32"/>
-        </w:rPr>
-      </w:pPr>
-    </w:p>
-    <w:p>
-      <w:pPr>
-        <w:jc w:val="center"/>
-        <w:rPr>
-          <w:sz w:val="32"/>
-        </w:rPr>
-      </w:pPr>
-      <w:r>
-        <w:rPr>
-          <w:sz w:val="32"/>
-        </w:rPr>
-        <w:t>Prepared for</w:t>
-      </w:r>
-    </w:p>
-    <w:p>
-      <w:pPr>
-        <w:jc w:val="center"/>
-        <w:rPr>
-          <w:sz w:val="32"/>
-        </w:rPr>
-      </w:pPr>
-      <w:r>
-        <w:rPr>
-          <w:sz w:val="32"/>
-        </w:rPr>
-        <w:t>MongoDB Course Project</w:t>
-      </w:r>
-    </w:p>
-    <w:p>
-      <w:pPr>
-        <w:jc w:val="center"/>
-        <w:rPr>
-          <w:sz w:val="32"/>
-        </w:rPr>
-      </w:pPr>
-      <w:r>
-        <w:rPr>
-          <w:sz w:val="32"/>
-        </w:rPr>
-        <w:t>October 2026</w:t>
-      </w:r>
-    </w:p>
-    <w:p>
-      <w:pPr>
-        <w:jc w:val="center"/>
-      </w:pPr>
-    </w:p>
-    <w:p>
-      <w:pPr>
-        <w:pStyle w:val="Header"/>
-        <w:tabs>
-          <w:tab w:val="clear" w:pos="4320"/>
-          <w:tab w:val="clear" w:pos="8640"/>
-        </w:tabs>
       </w:pPr>
     </w:p>
     <w:p>
@@ -1037,10 +1231,9 @@
     <w:p>
       <w:pPr>
         <w:sectPr>
-          <w:headerReference w:type="default" r:id="rId7"/>
-          <w:footerReference w:type="default" r:id="rId8"/>
-          <w:headerReference w:type="first" r:id="rId9"/>
-          <w:footerReference w:type="first" r:id="rId10"/>
+          <w:headerReference w:type="default" r:id="rId9"/>
+          <w:footerReference w:type="default" r:id="rId10"/>
+          <w:footerReference w:type="first" r:id="rId11"/>
           <w:pgSz w:w="12240" w:h="15840"/>
           <w:pgMar w:top="1440" w:right="1440" w:bottom="1440" w:left="1440" w:header="720" w:footer="720" w:gutter="0"/>
           <w:pgNumType w:fmt="lowerRoman" w:start="1"/>
@@ -1064,8 +1257,29 @@
       <w:pPr>
         <w:spacing w:after="120"/>
       </w:pPr>
-      <w:r>
-        <w:t>VaultX is a digital document management prototype. The application stores user accounts, document metadata, folders, and activity logs in MongoDB; binary files are uploaded through Cloudinary. The MongoDB course extension adds a Python analytics workflow using PyMongo to create indexes, seed isolated demo records, run aggregation queries, train two machine-learning models, and preserve evaluation results. This makes MongoDB both the operational data store and a source for reproducible analysis.</w:t>
+      <w:proofErr w:type="spellStart"/>
+      <w:r>
+        <w:t>VaultX</w:t>
+      </w:r>
+      <w:proofErr w:type="spellEnd"/>
+      <w:r>
+        <w:t xml:space="preserve"> is a digital document management prototype. The application stores user accounts, document metadata, folders, and activity logs in MongoDB; binary files are uploaded through </w:t>
+      </w:r>
+      <w:proofErr w:type="spellStart"/>
+      <w:r>
+        <w:t>Cloudinary</w:t>
+      </w:r>
+      <w:proofErr w:type="spellEnd"/>
+      <w:r>
+        <w:t xml:space="preserve">. The MongoDB course extension adds a Python analytics workflow using </w:t>
+      </w:r>
+      <w:proofErr w:type="spellStart"/>
+      <w:r>
+        <w:t>PyMongo</w:t>
+      </w:r>
+      <w:proofErr w:type="spellEnd"/>
+      <w:r>
+        <w:t xml:space="preserve"> to create indexes, seed isolated demo records, run aggregation queries, train two machine-learning models, and preserve evaluation results. This makes MongoDB both the operational data store and a source for reproducible analysis.</w:t>
       </w:r>
     </w:p>
     <w:p>
@@ -1095,12 +1309,14 @@
       <w:r>
         <w:t xml:space="preserve">2. Use </w:t>
       </w:r>
+      <w:proofErr w:type="spellStart"/>
       <w:r>
         <w:rPr>
           <w:b/>
         </w:rPr>
         <w:t>PyMongo</w:t>
       </w:r>
+      <w:proofErr w:type="spellEnd"/>
       <w:r>
         <w:t xml:space="preserve"> to query the existing collections, create useful indexes, aggregate file statistics, and write model-run records.</w:t>
       </w:r>
@@ -1194,8 +1410,17 @@
         <w:t>user</w:t>
       </w:r>
       <w:r>
-        <w:t xml:space="preserve"> (owner ObjectId), </w:t>
-      </w:r>
+        <w:t xml:space="preserve"> (owner </w:t>
+      </w:r>
+      <w:proofErr w:type="spellStart"/>
+      <w:r>
+        <w:t>ObjectId</w:t>
+      </w:r>
+      <w:proofErr w:type="spellEnd"/>
+      <w:r>
+        <w:t xml:space="preserve">), </w:t>
+      </w:r>
+      <w:proofErr w:type="spellStart"/>
       <w:r>
         <w:rPr>
           <w:rFonts w:ascii="Consolas" w:hAnsi="Consolas"/>
@@ -1203,9 +1428,11 @@
         </w:rPr>
         <w:t>fileName</w:t>
       </w:r>
+      <w:proofErr w:type="spellEnd"/>
       <w:r>
         <w:t xml:space="preserve">, </w:t>
       </w:r>
+      <w:proofErr w:type="spellStart"/>
       <w:r>
         <w:rPr>
           <w:rFonts w:ascii="Consolas" w:hAnsi="Consolas"/>
@@ -1213,9 +1440,11 @@
         </w:rPr>
         <w:t>fileType</w:t>
       </w:r>
+      <w:proofErr w:type="spellEnd"/>
       <w:r>
         <w:t xml:space="preserve"> (MIME type), </w:t>
       </w:r>
+      <w:proofErr w:type="spellStart"/>
       <w:r>
         <w:rPr>
           <w:rFonts w:ascii="Consolas" w:hAnsi="Consolas"/>
@@ -1223,9 +1452,11 @@
         </w:rPr>
         <w:t>fileSize</w:t>
       </w:r>
+      <w:proofErr w:type="spellEnd"/>
       <w:r>
         <w:t xml:space="preserve"> (legacy display string), </w:t>
       </w:r>
+      <w:proofErr w:type="spellStart"/>
       <w:r>
         <w:rPr>
           <w:rFonts w:ascii="Consolas" w:hAnsi="Consolas"/>
@@ -1233,9 +1464,11 @@
         </w:rPr>
         <w:t>sizeBytes</w:t>
       </w:r>
+      <w:proofErr w:type="spellEnd"/>
       <w:r>
         <w:t xml:space="preserve"> (new exact numeric size), </w:t>
       </w:r>
+      <w:proofErr w:type="spellStart"/>
       <w:r>
         <w:rPr>
           <w:rFonts w:ascii="Consolas" w:hAnsi="Consolas"/>
@@ -1243,9 +1476,11 @@
         </w:rPr>
         <w:t>isFolder</w:t>
       </w:r>
+      <w:proofErr w:type="spellEnd"/>
       <w:r>
         <w:t xml:space="preserve">, </w:t>
       </w:r>
+      <w:proofErr w:type="spellStart"/>
       <w:r>
         <w:rPr>
           <w:rFonts w:ascii="Consolas" w:hAnsi="Consolas"/>
@@ -1253,9 +1488,11 @@
         </w:rPr>
         <w:t>parentId</w:t>
       </w:r>
+      <w:proofErr w:type="spellEnd"/>
       <w:r>
         <w:t xml:space="preserve">, and </w:t>
       </w:r>
+      <w:proofErr w:type="spellStart"/>
       <w:r>
         <w:rPr>
           <w:rFonts w:ascii="Consolas" w:hAnsi="Consolas"/>
@@ -1263,9 +1500,11 @@
         </w:rPr>
         <w:t>createdAt</w:t>
       </w:r>
+      <w:proofErr w:type="spellEnd"/>
       <w:r>
         <w:t xml:space="preserve">. Folder records have no file size and are excluded from training. The Python projection reads only </w:t>
       </w:r>
+      <w:proofErr w:type="spellStart"/>
       <w:r>
         <w:rPr>
           <w:rFonts w:ascii="Consolas" w:hAnsi="Consolas"/>
@@ -1273,9 +1512,11 @@
         </w:rPr>
         <w:t>fileName</w:t>
       </w:r>
+      <w:proofErr w:type="spellEnd"/>
       <w:r>
         <w:t xml:space="preserve">, </w:t>
       </w:r>
+      <w:proofErr w:type="spellStart"/>
       <w:r>
         <w:rPr>
           <w:rFonts w:ascii="Consolas" w:hAnsi="Consolas"/>
@@ -1283,9 +1524,11 @@
         </w:rPr>
         <w:t>fileType</w:t>
       </w:r>
+      <w:proofErr w:type="spellEnd"/>
       <w:r>
         <w:t xml:space="preserve">, </w:t>
       </w:r>
+      <w:proofErr w:type="spellStart"/>
       <w:r>
         <w:rPr>
           <w:rFonts w:ascii="Consolas" w:hAnsi="Consolas"/>
@@ -1293,9 +1536,11 @@
         </w:rPr>
         <w:t>fileSize</w:t>
       </w:r>
+      <w:proofErr w:type="spellEnd"/>
       <w:r>
         <w:t xml:space="preserve">, </w:t>
       </w:r>
+      <w:proofErr w:type="spellStart"/>
       <w:r>
         <w:rPr>
           <w:rFonts w:ascii="Consolas" w:hAnsi="Consolas"/>
@@ -1303,9 +1548,11 @@
         </w:rPr>
         <w:t>sizeBytes</w:t>
       </w:r>
+      <w:proofErr w:type="spellEnd"/>
       <w:r>
         <w:t xml:space="preserve">, and </w:t>
       </w:r>
+      <w:proofErr w:type="spellStart"/>
       <w:r>
         <w:rPr>
           <w:rFonts w:ascii="Consolas" w:hAnsi="Consolas"/>
@@ -1313,6 +1560,7 @@
         </w:rPr>
         <w:t>isFolder</w:t>
       </w:r>
+      <w:proofErr w:type="spellEnd"/>
       <w:r>
         <w:t>.</w:t>
       </w:r>
@@ -1324,12 +1572,37 @@
       <w:r>
         <w:t xml:space="preserve">For a reproducible course demonstration, </w:t>
       </w:r>
-      <w:r>
-        <w:rPr>
-          <w:rFonts w:ascii="Consolas" w:hAnsi="Consolas"/>
-          <w:sz w:val="20"/>
-        </w:rPr>
-        <w:t>demo_documents()</w:t>
+      <w:proofErr w:type="spellStart"/>
+      <w:r>
+        <w:rPr>
+          <w:rFonts w:ascii="Consolas" w:hAnsi="Consolas"/>
+          <w:sz w:val="20"/>
+        </w:rPr>
+        <w:t>demo_</w:t>
+      </w:r>
+      <w:proofErr w:type="gramStart"/>
+      <w:r>
+        <w:rPr>
+          <w:rFonts w:ascii="Consolas" w:hAnsi="Consolas"/>
+          <w:sz w:val="20"/>
+        </w:rPr>
+        <w:t>documents</w:t>
+      </w:r>
+      <w:proofErr w:type="spellEnd"/>
+      <w:r>
+        <w:rPr>
+          <w:rFonts w:ascii="Consolas" w:hAnsi="Consolas"/>
+          <w:sz w:val="20"/>
+        </w:rPr>
+        <w:t>(</w:t>
+      </w:r>
+      <w:proofErr w:type="gramEnd"/>
+      <w:r>
+        <w:rPr>
+          <w:rFonts w:ascii="Consolas" w:hAnsi="Consolas"/>
+          <w:sz w:val="20"/>
+        </w:rPr>
+        <w:t>)</w:t>
       </w:r>
       <w:r>
         <w:t xml:space="preserve"> creates 600 synthetic metadata records with six MIME types: PDF, DOCX, XLSX, JPEG, PNG, and MP3. The random seed is 42. File sizes are sampled from type-specific Gaussian distributions and clipped to a positive minimum. On 29 October 2026, </w:t>
@@ -1342,8 +1615,17 @@
         <w:t>seed-demo</w:t>
       </w:r>
       <w:r>
-        <w:t xml:space="preserve"> upserted all 600 records into the separate Atlas </w:t>
-      </w:r>
+        <w:t xml:space="preserve"> </w:t>
+      </w:r>
+      <w:proofErr w:type="spellStart"/>
+      <w:r>
+        <w:t>upserted</w:t>
+      </w:r>
+      <w:proofErr w:type="spellEnd"/>
+      <w:r>
+        <w:t xml:space="preserve"> all 600 records into the separate Atlas </w:t>
+      </w:r>
+      <w:proofErr w:type="spellStart"/>
       <w:r>
         <w:rPr>
           <w:rFonts w:ascii="Consolas" w:hAnsi="Consolas"/>
@@ -1351,6 +1633,7 @@
         </w:rPr>
         <w:t>ml_demo_files</w:t>
       </w:r>
+      <w:proofErr w:type="spellEnd"/>
       <w:r>
         <w:t xml:space="preserve"> collection; no synthetic record was put into the application's </w:t>
       </w:r>
@@ -1388,7 +1671,15 @@
       </w:pPr>
       <w:bookmarkStart w:id="3" w:name="_Toc244257509"/>
       <w:r>
-        <w:t>4. MongoDB and PyMongo implementation</w:t>
+        <w:t xml:space="preserve">4. MongoDB and </w:t>
+      </w:r>
+      <w:proofErr w:type="spellStart"/>
+      <w:r>
+        <w:t>PyMongo</w:t>
+      </w:r>
+      <w:proofErr w:type="spellEnd"/>
+      <w:r>
+        <w:t xml:space="preserve"> implementation</w:t>
       </w:r>
       <w:bookmarkEnd w:id="3"/>
     </w:p>
@@ -1409,6 +1700,7 @@
       <w:r>
         <w:t xml:space="preserve">) uses </w:t>
       </w:r>
+      <w:proofErr w:type="spellStart"/>
       <w:r>
         <w:rPr>
           <w:rFonts w:ascii="Consolas" w:hAnsi="Consolas"/>
@@ -1416,8 +1708,17 @@
         </w:rPr>
         <w:t>MongoClient</w:t>
       </w:r>
-      <w:r>
-        <w:t xml:space="preserve"> from PyMongo, validates the </w:t>
+      <w:proofErr w:type="spellEnd"/>
+      <w:r>
+        <w:t xml:space="preserve"> from </w:t>
+      </w:r>
+      <w:proofErr w:type="spellStart"/>
+      <w:r>
+        <w:t>PyMongo</w:t>
+      </w:r>
+      <w:proofErr w:type="spellEnd"/>
+      <w:r>
+        <w:t xml:space="preserve">, validates the </w:t>
       </w:r>
       <w:r>
         <w:lastRenderedPageBreak/>
@@ -1443,6 +1744,7 @@
       <w:r>
         <w:t xml:space="preserve"> or </w:t>
       </w:r>
+      <w:proofErr w:type="spellStart"/>
       <w:r>
         <w:rPr>
           <w:rFonts w:ascii="Consolas" w:hAnsi="Consolas"/>
@@ -1450,9 +1752,11 @@
         </w:rPr>
         <w:t>ml_demo_files</w:t>
       </w:r>
+      <w:proofErr w:type="spellEnd"/>
       <w:r>
         <w:t xml:space="preserve"> collection. New uploads store </w:t>
       </w:r>
+      <w:proofErr w:type="spellStart"/>
       <w:r>
         <w:rPr>
           <w:rFonts w:ascii="Consolas" w:hAnsi="Consolas"/>
@@ -1460,9 +1764,11 @@
         </w:rPr>
         <w:t>sizeBytes</w:t>
       </w:r>
+      <w:proofErr w:type="spellEnd"/>
       <w:r>
         <w:t xml:space="preserve"> as a number while retaining </w:t>
       </w:r>
+      <w:proofErr w:type="spellStart"/>
       <w:r>
         <w:rPr>
           <w:rFonts w:ascii="Consolas" w:hAnsi="Consolas"/>
@@ -1470,6 +1776,7 @@
         </w:rPr>
         <w:t>fileSize</w:t>
       </w:r>
+      <w:proofErr w:type="spellEnd"/>
       <w:r>
         <w:t xml:space="preserve"> for current UI compatibility.</w:t>
       </w:r>
@@ -1478,6 +1785,7 @@
       <w:pPr>
         <w:spacing w:after="120"/>
       </w:pPr>
+      <w:proofErr w:type="spellStart"/>
       <w:r>
         <w:rPr>
           <w:rFonts w:ascii="Consolas" w:hAnsi="Consolas"/>
@@ -1485,6 +1793,7 @@
         </w:rPr>
         <w:t>init-db</w:t>
       </w:r>
+      <w:proofErr w:type="spellEnd"/>
       <w:r>
         <w:t xml:space="preserve"> creates a compound </w:t>
       </w:r>
@@ -1503,7 +1812,39 @@
           <w:rFonts w:ascii="Consolas" w:hAnsi="Consolas"/>
           <w:sz w:val="20"/>
         </w:rPr>
-        <w:t>(user, parentId, createdAt)</w:t>
+        <w:t xml:space="preserve">(user, </w:t>
+      </w:r>
+      <w:proofErr w:type="spellStart"/>
+      <w:r>
+        <w:rPr>
+          <w:rFonts w:ascii="Consolas" w:hAnsi="Consolas"/>
+          <w:sz w:val="20"/>
+        </w:rPr>
+        <w:t>parentId</w:t>
+      </w:r>
+      <w:proofErr w:type="spellEnd"/>
+      <w:r>
+        <w:rPr>
+          <w:rFonts w:ascii="Consolas" w:hAnsi="Consolas"/>
+          <w:sz w:val="20"/>
+        </w:rPr>
+        <w:t xml:space="preserve">, </w:t>
+      </w:r>
+      <w:proofErr w:type="spellStart"/>
+      <w:r>
+        <w:rPr>
+          <w:rFonts w:ascii="Consolas" w:hAnsi="Consolas"/>
+          <w:sz w:val="20"/>
+        </w:rPr>
+        <w:t>createdAt</w:t>
+      </w:r>
+      <w:proofErr w:type="spellEnd"/>
+      <w:r>
+        <w:rPr>
+          <w:rFonts w:ascii="Consolas" w:hAnsi="Consolas"/>
+          <w:sz w:val="20"/>
+        </w:rPr>
+        <w:t>)</w:t>
       </w:r>
       <w:r>
         <w:t xml:space="preserve"> for owner and folder views, an </w:t>
@@ -1523,11 +1864,28 @@
           <w:rFonts w:ascii="Consolas" w:hAnsi="Consolas"/>
           <w:sz w:val="20"/>
         </w:rPr>
-        <w:t>(user, createdAt)</w:t>
+        <w:t xml:space="preserve">(user, </w:t>
+      </w:r>
+      <w:proofErr w:type="spellStart"/>
+      <w:r>
+        <w:rPr>
+          <w:rFonts w:ascii="Consolas" w:hAnsi="Consolas"/>
+          <w:sz w:val="20"/>
+        </w:rPr>
+        <w:t>createdAt</w:t>
+      </w:r>
+      <w:proofErr w:type="spellEnd"/>
+      <w:r>
+        <w:rPr>
+          <w:rFonts w:ascii="Consolas" w:hAnsi="Consolas"/>
+          <w:sz w:val="20"/>
+        </w:rPr>
+        <w:t>)</w:t>
       </w:r>
       <w:r>
         <w:t xml:space="preserve"> for recent logs, a unique </w:t>
       </w:r>
+      <w:proofErr w:type="spellStart"/>
       <w:r>
         <w:rPr>
           <w:rFonts w:ascii="Consolas" w:hAnsi="Consolas"/>
@@ -1535,9 +1893,19 @@
         </w:rPr>
         <w:t>demoId</w:t>
       </w:r>
-      <w:r>
-        <w:t xml:space="preserve"> index for repeatable upserts, and a descending </w:t>
-      </w:r>
+      <w:proofErr w:type="spellEnd"/>
+      <w:r>
+        <w:t xml:space="preserve"> index for repeatable </w:t>
+      </w:r>
+      <w:proofErr w:type="spellStart"/>
+      <w:r>
+        <w:t>upserts</w:t>
+      </w:r>
+      <w:proofErr w:type="spellEnd"/>
+      <w:r>
+        <w:t xml:space="preserve">, and a descending </w:t>
+      </w:r>
+      <w:proofErr w:type="spellStart"/>
       <w:r>
         <w:rPr>
           <w:rFonts w:ascii="Consolas" w:hAnsi="Consolas"/>
@@ -1545,6 +1913,7 @@
         </w:rPr>
         <w:t>createdAt</w:t>
       </w:r>
+      <w:proofErr w:type="spellEnd"/>
       <w:r>
         <w:t xml:space="preserve"> index for model-run history. These indexes were created in Atlas on 29 October 2026. </w:t>
       </w:r>
@@ -1588,6 +1957,7 @@
       <w:r>
         <w:t xml:space="preserve"> by count. The live demo summary returned 100 records for each of the six MIME types. MongoDB-backed training wrote metrics and source information to </w:t>
       </w:r>
+      <w:proofErr w:type="spellStart"/>
       <w:r>
         <w:rPr>
           <w:rFonts w:ascii="Consolas" w:hAnsi="Consolas"/>
@@ -1595,6 +1965,7 @@
         </w:rPr>
         <w:t>ml_model_runs</w:t>
       </w:r>
+      <w:proofErr w:type="spellEnd"/>
       <w:r>
         <w:t>. Existing app searches use a case-insensitive regular expression; that search pattern is not fully optimized by the added index.</w:t>
       </w:r>
@@ -1621,8 +1992,17 @@
           <w:rFonts w:ascii="Consolas" w:hAnsi="Consolas"/>
           <w:sz w:val="20"/>
         </w:rPr>
-        <w:t>--mongo-uri</w:t>
-      </w:r>
+        <w:t>--mongo-</w:t>
+      </w:r>
+      <w:proofErr w:type="spellStart"/>
+      <w:r>
+        <w:rPr>
+          <w:rFonts w:ascii="Consolas" w:hAnsi="Consolas"/>
+          <w:sz w:val="20"/>
+        </w:rPr>
+        <w:t>uri</w:t>
+      </w:r>
+      <w:proofErr w:type="spellEnd"/>
       <w:r>
         <w:t xml:space="preserve">, and </w:t>
       </w:r>
@@ -1644,7 +2024,15 @@
         <w:t>check</w:t>
       </w:r>
       <w:r>
-        <w:t xml:space="preserve"> command pings MongoDB and reports the selected database, usable records, class counts, and training eligibility. Commands do not print credentials. The analytics code does not request Cloudinary URLs, passwords, billing data, or file contents.</w:t>
+        <w:t xml:space="preserve"> command pings MongoDB and reports the selected database, usable records, class counts, and training eligibility. Commands do not print credentials. The analytics code does not request </w:t>
+      </w:r>
+      <w:proofErr w:type="spellStart"/>
+      <w:r>
+        <w:t>Cloudinary</w:t>
+      </w:r>
+      <w:proofErr w:type="spellEnd"/>
+      <w:r>
+        <w:t xml:space="preserve"> URLs, passwords, billing data, or file contents.</w:t>
       </w:r>
     </w:p>
     <w:p>
@@ -1664,6 +2052,7 @@
       <w:r>
         <w:t xml:space="preserve">Folders, missing sizes, zero sizes, and invalid legacy size strings are excluded. Numeric </w:t>
       </w:r>
+      <w:proofErr w:type="spellStart"/>
       <w:r>
         <w:rPr>
           <w:rFonts w:ascii="Consolas" w:hAnsi="Consolas"/>
@@ -1671,6 +2060,7 @@
         </w:rPr>
         <w:t>sizeBytes</w:t>
       </w:r>
+      <w:proofErr w:type="spellEnd"/>
       <w:r>
         <w:t xml:space="preserve"> is preferred and converted from bytes to MB. Older strings such as </w:t>
       </w:r>
@@ -1749,6 +2139,7 @@
       <w:r>
         <w:t xml:space="preserve">Two scikit-learn pipelines use the same metadata features. </w:t>
       </w:r>
+      <w:proofErr w:type="spellStart"/>
       <w:r>
         <w:rPr>
           <w:rFonts w:ascii="Consolas" w:hAnsi="Consolas"/>
@@ -1756,9 +2147,11 @@
         </w:rPr>
         <w:t>RandomForestRegressor</w:t>
       </w:r>
+      <w:proofErr w:type="spellEnd"/>
       <w:r>
         <w:t xml:space="preserve"> has 150 trees, maximum depth 8, and minimum leaf size 3. </w:t>
       </w:r>
+      <w:proofErr w:type="spellStart"/>
       <w:r>
         <w:rPr>
           <w:rFonts w:ascii="Consolas" w:hAnsi="Consolas"/>
@@ -1766,8 +2159,17 @@
         </w:rPr>
         <w:t>RandomForestClassifier</w:t>
       </w:r>
-      <w:r>
-        <w:t xml:space="preserve"> uses the same tree settings and balanced class weights. The models are fit only on the training split. Evaluations are calculated only on the held-out test split. Trained pipelines are saved as local Joblib files for inspection or later inference; they should only be loaded from a trusted local source.</w:t>
+      <w:proofErr w:type="spellEnd"/>
+      <w:r>
+        <w:t xml:space="preserve"> uses the same tree settings and balanced class weights. The models are fit only on the training split. Evaluations are calculated only on the held-out test split. Trained pipelines are saved as local </w:t>
+      </w:r>
+      <w:proofErr w:type="spellStart"/>
+      <w:r>
+        <w:t>Joblib</w:t>
+      </w:r>
+      <w:proofErr w:type="spellEnd"/>
+      <w:r>
+        <w:t xml:space="preserve"> files for inspection or later inference; they should only be loaded from a trusted local source.</w:t>
       </w:r>
     </w:p>
     <w:p>
@@ -1794,8 +2196,17 @@
           <w:rFonts w:ascii="Consolas" w:hAnsi="Consolas"/>
           <w:sz w:val="20"/>
         </w:rPr>
-        <w:t>analytics/results/metrics.json</w:t>
-      </w:r>
+        <w:t>analytics/results/</w:t>
+      </w:r>
+      <w:proofErr w:type="spellStart"/>
+      <w:r>
+        <w:rPr>
+          <w:rFonts w:ascii="Consolas" w:hAnsi="Consolas"/>
+          <w:sz w:val="20"/>
+        </w:rPr>
+        <w:t>metrics.json</w:t>
+      </w:r>
+      <w:proofErr w:type="spellEnd"/>
       <w:r>
         <w:t xml:space="preserve"> after running </w:t>
       </w:r>
@@ -1819,6 +2230,7 @@
       <w:r>
         <w:t xml:space="preserve"> against MongoDB Atlas with seed 42 and 600 records. The MongoDB-backed run saved a record in </w:t>
       </w:r>
+      <w:proofErr w:type="spellStart"/>
       <w:r>
         <w:rPr>
           <w:rFonts w:ascii="Consolas" w:hAnsi="Consolas"/>
@@ -1826,6 +2238,7 @@
         </w:rPr>
         <w:t>ml_model_runs</w:t>
       </w:r>
+      <w:proofErr w:type="spellEnd"/>
       <w:r>
         <w:t xml:space="preserve">. An offline </w:t>
       </w:r>
@@ -2251,8 +2664,17 @@
           <w:rFonts w:ascii="Consolas" w:hAnsi="Consolas"/>
           <w:sz w:val="18"/>
         </w:rPr>
-        <w:t>python vault_ml.py init-db</w:t>
-      </w:r>
+        <w:t xml:space="preserve">python vault_ml.py </w:t>
+      </w:r>
+      <w:proofErr w:type="spellStart"/>
+      <w:r>
+        <w:rPr>
+          <w:rFonts w:ascii="Consolas" w:hAnsi="Consolas"/>
+          <w:sz w:val="18"/>
+        </w:rPr>
+        <w:t>init-db</w:t>
+      </w:r>
+      <w:proofErr w:type="spellEnd"/>
     </w:p>
     <w:p>
       <w:pPr>
@@ -2336,18 +2758,41 @@
           <w:rFonts w:ascii="Consolas" w:hAnsi="Consolas"/>
           <w:sz w:val="20"/>
         </w:rPr>
-        <w:t>results/metrics.json</w:t>
-      </w:r>
-      <w:r>
-        <w:t xml:space="preserve"> and two </w:t>
-      </w:r>
-      <w:r>
-        <w:rPr>
-          <w:rFonts w:ascii="Consolas" w:hAnsi="Consolas"/>
-          <w:sz w:val="20"/>
-        </w:rPr>
-        <w:t>.joblib</w:t>
-      </w:r>
+        <w:t>results/</w:t>
+      </w:r>
+      <w:proofErr w:type="spellStart"/>
+      <w:r>
+        <w:rPr>
+          <w:rFonts w:ascii="Consolas" w:hAnsi="Consolas"/>
+          <w:sz w:val="20"/>
+        </w:rPr>
+        <w:t>metrics.json</w:t>
+      </w:r>
+      <w:proofErr w:type="spellEnd"/>
+      <w:r>
+        <w:t xml:space="preserve"> and </w:t>
+      </w:r>
+      <w:proofErr w:type="gramStart"/>
+      <w:r>
+        <w:t xml:space="preserve">two </w:t>
+      </w:r>
+      <w:r>
+        <w:rPr>
+          <w:rFonts w:ascii="Consolas" w:hAnsi="Consolas"/>
+          <w:sz w:val="20"/>
+        </w:rPr>
+        <w:t>.</w:t>
+      </w:r>
+      <w:proofErr w:type="spellStart"/>
+      <w:r>
+        <w:rPr>
+          <w:rFonts w:ascii="Consolas" w:hAnsi="Consolas"/>
+          <w:sz w:val="20"/>
+        </w:rPr>
+        <w:t>joblib</w:t>
+      </w:r>
+      <w:proofErr w:type="spellEnd"/>
+      <w:proofErr w:type="gramEnd"/>
       <w:r>
         <w:t xml:space="preserve"> model files without touching MongoDB. Mongo-backed </w:t>
       </w:r>
@@ -2361,6 +2806,7 @@
       <w:r>
         <w:t xml:space="preserve"> also inserts a document in </w:t>
       </w:r>
+      <w:proofErr w:type="spellStart"/>
       <w:r>
         <w:rPr>
           <w:rFonts w:ascii="Consolas" w:hAnsi="Consolas"/>
@@ -2368,6 +2814,7 @@
         </w:rPr>
         <w:t>ml_model_runs</w:t>
       </w:r>
+      <w:proofErr w:type="spellEnd"/>
       <w:r>
         <w:t>.</w:t>
       </w:r>
@@ -2387,15 +2834,20 @@
         <w:spacing w:after="120"/>
       </w:pPr>
       <w:r>
-        <w:t>The extension demonstrates a complete MongoDB/PyMongo analytics workflow around the existing document vault: indexed operational data, a live aggregation pipeline, reproducible demo data in MongoDB, metadata preprocessing, two trained models, and all six requested evaluation metrics. The reported demo metrics describe synthetic file-size patterns only. A real-data study should collect enough consented file metadata, rerun the held-out evaluation, compare simpler baselines, and examine whether MIME-based pre</w:t>
-      </w:r>
-      <w:r>
-        <w:t>dictions are useful for the intended product decision. The application also needs separate security and payment-flow remediation before any production use.</w:t>
+        <w:t>The extension demonstrates a complete MongoDB/</w:t>
+      </w:r>
+      <w:proofErr w:type="spellStart"/>
+      <w:r>
+        <w:t>PyMongo</w:t>
+      </w:r>
+      <w:proofErr w:type="spellEnd"/>
+      <w:r>
+        <w:t xml:space="preserve"> analytics workflow around the existing document vault: indexed operational data, a live aggregation pipeline, reproducible demo data in MongoDB, metadata preprocessing, two trained models, and all six requested evaluation metrics. The reported demo metrics describe synthetic file-size patterns only. A real-data study should collect enough consented file metadata, rerun the held-out evaluation, compare simpler baselines, and examine whether MIME-based predictions are useful for the intended product decision. The application also needs separate security and payment-flow remediation before any production use.</w:t>
       </w:r>
     </w:p>
     <w:sectPr>
-      <w:headerReference w:type="default" r:id="rId11"/>
-      <w:footerReference w:type="default" r:id="rId12"/>
+      <w:headerReference w:type="default" r:id="rId12"/>
+      <w:footerReference w:type="default" r:id="rId13"/>
       <w:pgSz w:w="12240" w:h="15840"/>
       <w:pgMar w:top="1440" w:right="1440" w:bottom="1440" w:left="1440" w:header="720" w:footer="720" w:gutter="0"/>
       <w:pgNumType w:start="1"/>
@@ -2566,9 +3018,6 @@
         <w:tab w:val="right" w:pos="9360"/>
       </w:tabs>
     </w:pPr>
-    <w:r>
-      <w:t>VaultX</w:t>
-    </w:r>
   </w:p>
 </w:hdr>
 </file>
@@ -2579,22 +3028,11 @@
     <w:pPr>
       <w:pStyle w:val="Header"/>
     </w:pPr>
+    <w:proofErr w:type="spellStart"/>
     <w:r>
       <w:t>VaultX</w:t>
     </w:r>
-  </w:p>
-</w:hdr>
-</file>
-
-<file path=word/header3.xml><?xml version="1.0" encoding="utf-8"?>
-<w:hdr xmlns:wpc="http://schemas.microsoft.com/office/word/2010/wordprocessingCanvas" xmlns:cx="http://schemas.microsoft.com/office/drawing/2014/chartex" xmlns:cx1="http://schemas.microsoft.com/office/drawing/2015/9/8/chartex" xmlns:cx2="http://schemas.microsoft.com/office/drawing/2015/10/21/chartex" xmlns:cx3="http://schemas.microsoft.com/office/drawing/2016/5/9/chartex" xmlns:cx4="http://schemas.microsoft.com/office/drawing/2016/5/10/chartex" xmlns:cx5="http://schemas.microsoft.com/office/drawing/2016/5/11/chartex" xmlns:cx6="http://schemas.microsoft.com/office/drawing/2016/5/12/chartex" xmlns:cx7="http://schemas.microsoft.com/office/drawing/2016/5/13/chartex" xmlns:cx8="http://schemas.microsoft.com/office/drawing/2016/5/14/chartex" xmlns:mc="http://schemas.openxmlformats.org/markup-compatibility/2006" xmlns:aink="http://schemas.microsoft.com/office/drawing/2016/ink" xmlns:am3d="http://schemas.microsoft.com/office/drawing/2017/model3d" xmlns:o="urn:schemas-microsoft-com:office:office" xmlns:oel="http://schemas.microsoft.com/office/2019/extlst" xmlns:r="http://schemas.openxmlformats.org/officeDocument/2006/relationships" xmlns:m="http://schemas.openxmlformats.org/officeDocument/2006/math" xmlns:v="urn:schemas-microsoft-com:vml" xmlns:wp14="http://schemas.microsoft.com/office/word/2010/wordprocessingDrawing" xmlns:wp="http://schemas.openxmlformats.org/drawingml/2006/wordprocessingDrawing" xmlns:w10="urn:schemas-microsoft-com:office:word" xmlns:w="http://schemas.openxmlformats.org/wordprocessingml/2006/main" xmlns:w14="http://schemas.microsoft.com/office/word/2010/wordml" xmlns:w15="http://schemas.microsoft.com/office/word/2012/wordml" xmlns:w16cex="http://schemas.microsoft.com/office/word/2018/wordml/cex" xmlns:w16cid="http://schemas.microsoft.com/office/word/2016/wordml/cid" xmlns:w16="http://schemas.microsoft.com/office/word/2018/wordml" xmlns:w16du="http://schemas.microsoft.com/office/word/2023/wordml/word16du" xmlns:w16sdtdh="http://schemas.microsoft.com/office/word/2020/wordml/sdtdatahash" xmlns:w16sdtfl="http://schemas.microsoft.com/office/word/2024/wordml/sdtformatlock" xmlns:w16se="http://schemas.microsoft.com/office/word/2015/wordml/symex" xmlns:wpg="http://schemas.microsoft.com/office/word/2010/wordprocessingGroup" xmlns:wpi="http://schemas.microsoft.com/office/word/2010/wordprocessingInk" xmlns:wne="http://schemas.microsoft.com/office/word/2006/wordml" xmlns:wps="http://schemas.microsoft.com/office/word/2010/wordprocessingShape" mc:Ignorable="w14 w15 w16se w16cid w16 w16cex w16sdtdh w16sdtfl w16du wp14">
-  <w:p>
-    <w:pPr>
-      <w:pStyle w:val="Header"/>
-    </w:pPr>
-    <w:r>
-      <w:t>VaultX</w:t>
-    </w:r>
+    <w:proofErr w:type="spellEnd"/>
   </w:p>
 </w:hdr>
 </file>
@@ -3214,7 +3652,6 @@
   <w:style w:type="character" w:default="1" w:styleId="DefaultParagraphFont">
     <w:name w:val="Default Paragraph Font"/>
     <w:uiPriority w:val="1"/>
-    <w:semiHidden/>
     <w:unhideWhenUsed/>
   </w:style>
   <w:style w:type="table" w:default="1" w:styleId="TableNormal">
@@ -3429,6 +3866,37 @@
     <w:rPr>
       <w:color w:val="0000FF" w:themeColor="hyperlink"/>
       <w:u w:val="single"/>
+    </w:rPr>
+  </w:style>
+  <w:style w:type="table" w:styleId="TableGrid">
+    <w:name w:val="Table Grid"/>
+    <w:basedOn w:val="TableNormal"/>
+    <w:uiPriority w:val="59"/>
+    <w:rsid w:val="007E7A51"/>
+    <w:pPr>
+      <w:spacing w:after="0" w:line="240" w:lineRule="auto"/>
+    </w:pPr>
+    <w:tblPr>
+      <w:tblBorders>
+        <w:top w:val="single" w:sz="4" w:space="0" w:color="auto"/>
+        <w:left w:val="single" w:sz="4" w:space="0" w:color="auto"/>
+        <w:bottom w:val="single" w:sz="4" w:space="0" w:color="auto"/>
+        <w:right w:val="single" w:sz="4" w:space="0" w:color="auto"/>
+        <w:insideH w:val="single" w:sz="4" w:space="0" w:color="auto"/>
+        <w:insideV w:val="single" w:sz="4" w:space="0" w:color="auto"/>
+      </w:tblBorders>
+    </w:tblPr>
+  </w:style>
+  <w:style w:type="character" w:styleId="UnresolvedMention">
+    <w:name w:val="Unresolved Mention"/>
+    <w:basedOn w:val="DefaultParagraphFont"/>
+    <w:uiPriority w:val="99"/>
+    <w:semiHidden/>
+    <w:unhideWhenUsed/>
+    <w:rsid w:val="00462D03"/>
+    <w:rPr>
+      <w:color w:val="605E5C"/>
+      <w:shd w:val="clear" w:color="auto" w:fill="E1DFDD"/>
     </w:rPr>
   </w:style>
 </w:styles>

</xml_diff>